<commit_message>
Exportação do relatório em pdf
</commit_message>
<xml_diff>
--- a/nrz_i/docs/documentacao_projeto.docx
+++ b/nrz_i/docs/documentacao_projeto.docx
@@ -30,6 +30,20 @@
         </w:rPr>
         <w:t>Documentação Técnica — Modulação Unipolar NRZ-I em VHDL</w:t>
       </w:r>
+    </w:p>
+    <w:p>
+      <w:pPr>
+        <w:spacing w:before="100" w:beforeAutospacing="1" w:after="100" w:afterAutospacing="1" w:line="240" w:lineRule="auto"/>
+        <w:outlineLvl w:val="1"/>
+        <w:rPr>
+          <w:rFonts w:ascii="Arial" w:eastAsia="Times New Roman" w:hAnsi="Arial" w:cs="Arial"/>
+          <w:b/>
+          <w:bCs/>
+          <w:kern w:val="0"/>
+          <w:lang w:eastAsia="pt-BR"/>
+          <w14:ligatures w14:val="none"/>
+        </w:rPr>
+      </w:pPr>
     </w:p>
     <w:p>
       <w:pPr>
@@ -464,7 +478,18 @@
           <w:lang w:eastAsia="pt-BR"/>
           <w14:ligatures w14:val="none"/>
         </w:rPr>
-        <w:t>3. Interface do Módulo</w:t>
+        <w:t>2</w:t>
+      </w:r>
+      <w:r>
+        <w:rPr>
+          <w:rFonts w:ascii="Arial" w:eastAsia="Times New Roman" w:hAnsi="Arial" w:cs="Arial"/>
+          <w:b/>
+          <w:bCs/>
+          <w:kern w:val="0"/>
+          <w:lang w:eastAsia="pt-BR"/>
+          <w14:ligatures w14:val="none"/>
+        </w:rPr>
+        <w:t>. Interface do Módulo</w:t>
       </w:r>
     </w:p>
     <w:p>
@@ -1160,6 +1185,7 @@
                 <w:lang w:eastAsia="pt-BR"/>
                 <w14:ligatures w14:val="none"/>
               </w:rPr>
+              <w:lastRenderedPageBreak/>
               <w:t>nrzi_out</w:t>
             </w:r>
             <w:proofErr w:type="spellEnd"/>
@@ -1238,6 +1264,17 @@
     </w:p>
     <w:p>
       <w:pPr>
+        <w:spacing w:after="0" w:line="240" w:lineRule="auto"/>
+        <w:rPr>
+          <w:rFonts w:ascii="Arial" w:eastAsia="Times New Roman" w:hAnsi="Arial" w:cs="Arial"/>
+          <w:kern w:val="0"/>
+          <w:lang w:eastAsia="pt-BR"/>
+          <w14:ligatures w14:val="none"/>
+        </w:rPr>
+      </w:pPr>
+    </w:p>
+    <w:p>
+      <w:pPr>
         <w:spacing w:before="100" w:beforeAutospacing="1" w:after="100" w:afterAutospacing="1" w:line="240" w:lineRule="auto"/>
         <w:outlineLvl w:val="1"/>
         <w:rPr>
@@ -1258,8 +1295,18 @@
           <w:lang w:eastAsia="pt-BR"/>
           <w14:ligatures w14:val="none"/>
         </w:rPr>
-        <w:lastRenderedPageBreak/>
-        <w:t>4. Parâmetros Configuráveis (</w:t>
+        <w:t>3</w:t>
+      </w:r>
+      <w:r>
+        <w:rPr>
+          <w:rFonts w:ascii="Arial" w:eastAsia="Times New Roman" w:hAnsi="Arial" w:cs="Arial"/>
+          <w:b/>
+          <w:bCs/>
+          <w:kern w:val="0"/>
+          <w:lang w:eastAsia="pt-BR"/>
+          <w14:ligatures w14:val="none"/>
+        </w:rPr>
+        <w:t>. Parâmetros Configuráveis (</w:t>
       </w:r>
       <w:proofErr w:type="spellStart"/>
       <w:r>
@@ -1704,6 +1751,17 @@
     <w:p>
       <w:pPr>
         <w:spacing w:before="100" w:beforeAutospacing="1" w:after="100" w:afterAutospacing="1" w:line="240" w:lineRule="auto"/>
+        <w:rPr>
+          <w:rFonts w:ascii="Arial" w:eastAsia="Times New Roman" w:hAnsi="Arial" w:cs="Arial"/>
+          <w:kern w:val="0"/>
+          <w:lang w:eastAsia="pt-BR"/>
+          <w14:ligatures w14:val="none"/>
+        </w:rPr>
+      </w:pPr>
+    </w:p>
+    <w:p>
+      <w:pPr>
+        <w:spacing w:before="100" w:beforeAutospacing="1" w:after="100" w:afterAutospacing="1" w:line="240" w:lineRule="auto"/>
         <w:outlineLvl w:val="1"/>
         <w:rPr>
           <w:rFonts w:ascii="Arial" w:eastAsia="Times New Roman" w:hAnsi="Arial" w:cs="Arial"/>
@@ -1723,7 +1781,18 @@
           <w:lang w:eastAsia="pt-BR"/>
           <w14:ligatures w14:val="none"/>
         </w:rPr>
-        <w:t>5. Funcionamento Interno</w:t>
+        <w:t>4</w:t>
+      </w:r>
+      <w:r>
+        <w:rPr>
+          <w:rFonts w:ascii="Arial" w:eastAsia="Times New Roman" w:hAnsi="Arial" w:cs="Arial"/>
+          <w:b/>
+          <w:bCs/>
+          <w:kern w:val="0"/>
+          <w:lang w:eastAsia="pt-BR"/>
+          <w14:ligatures w14:val="none"/>
+        </w:rPr>
+        <w:t>. Funcionamento Interno</w:t>
       </w:r>
     </w:p>
     <w:p>
@@ -1748,7 +1817,18 @@
           <w:lang w:eastAsia="pt-BR"/>
           <w14:ligatures w14:val="none"/>
         </w:rPr>
-        <w:t>5.1 Captura da sequência de bits</w:t>
+        <w:t>4</w:t>
+      </w:r>
+      <w:r>
+        <w:rPr>
+          <w:rFonts w:ascii="Arial" w:eastAsia="Times New Roman" w:hAnsi="Arial" w:cs="Arial"/>
+          <w:b/>
+          <w:bCs/>
+          <w:kern w:val="0"/>
+          <w:lang w:eastAsia="pt-BR"/>
+          <w14:ligatures w14:val="none"/>
+        </w:rPr>
+        <w:t>.1 Captura da sequência de bits</w:t>
       </w:r>
     </w:p>
     <w:p>
@@ -1846,17 +1926,6 @@
         </w:rPr>
         <w:t>Esse registrador mantém os dados estáveis durante toda a transmissão.</w:t>
       </w:r>
-    </w:p>
-    <w:p>
-      <w:pPr>
-        <w:spacing w:after="0" w:line="240" w:lineRule="auto"/>
-        <w:rPr>
-          <w:rFonts w:ascii="Arial" w:eastAsia="Times New Roman" w:hAnsi="Arial" w:cs="Arial"/>
-          <w:kern w:val="0"/>
-          <w:lang w:eastAsia="pt-BR"/>
-          <w14:ligatures w14:val="none"/>
-        </w:rPr>
-      </w:pPr>
     </w:p>
     <w:p>
       <w:pPr>
@@ -1880,7 +1949,18 @@
           <w:lang w:eastAsia="pt-BR"/>
           <w14:ligatures w14:val="none"/>
         </w:rPr>
-        <w:t xml:space="preserve">5.2 </w:t>
+        <w:t>4</w:t>
+      </w:r>
+      <w:r>
+        <w:rPr>
+          <w:rFonts w:ascii="Arial" w:eastAsia="Times New Roman" w:hAnsi="Arial" w:cs="Arial"/>
+          <w:b/>
+          <w:bCs/>
+          <w:kern w:val="0"/>
+          <w:lang w:eastAsia="pt-BR"/>
+          <w14:ligatures w14:val="none"/>
+        </w:rPr>
+        <w:t xml:space="preserve">.2 </w:t>
       </w:r>
       <w:proofErr w:type="spellStart"/>
       <w:r>
@@ -2121,17 +2201,6 @@
     </w:p>
     <w:p>
       <w:pPr>
-        <w:spacing w:after="0" w:line="240" w:lineRule="auto"/>
-        <w:rPr>
-          <w:rFonts w:ascii="Arial" w:eastAsia="Times New Roman" w:hAnsi="Arial" w:cs="Arial"/>
-          <w:kern w:val="0"/>
-          <w:lang w:eastAsia="pt-BR"/>
-          <w14:ligatures w14:val="none"/>
-        </w:rPr>
-      </w:pPr>
-    </w:p>
-    <w:p>
-      <w:pPr>
         <w:spacing w:before="100" w:beforeAutospacing="1" w:after="100" w:afterAutospacing="1" w:line="240" w:lineRule="auto"/>
         <w:outlineLvl w:val="2"/>
         <w:rPr>
@@ -2152,7 +2221,18 @@
           <w:lang w:eastAsia="pt-BR"/>
           <w14:ligatures w14:val="none"/>
         </w:rPr>
-        <w:t>5.3 Controle de transmissão</w:t>
+        <w:t>4</w:t>
+      </w:r>
+      <w:r>
+        <w:rPr>
+          <w:rFonts w:ascii="Arial" w:eastAsia="Times New Roman" w:hAnsi="Arial" w:cs="Arial"/>
+          <w:b/>
+          <w:bCs/>
+          <w:kern w:val="0"/>
+          <w:lang w:eastAsia="pt-BR"/>
+          <w14:ligatures w14:val="none"/>
+        </w:rPr>
+        <w:t>.3 Controle de transmissão</w:t>
       </w:r>
     </w:p>
     <w:p>
@@ -2212,6 +2292,7 @@
           <w:lang w:eastAsia="pt-BR"/>
           <w14:ligatures w14:val="none"/>
         </w:rPr>
+        <w:lastRenderedPageBreak/>
         <w:t>Segue seu funcionamento:</w:t>
       </w:r>
     </w:p>
@@ -2310,7 +2391,6 @@
                 <w:lang w:eastAsia="pt-BR"/>
                 <w14:ligatures w14:val="none"/>
               </w:rPr>
-              <w:lastRenderedPageBreak/>
               <w:t>reset_n</w:t>
             </w:r>
             <w:proofErr w:type="spellEnd"/>
@@ -2529,17 +2609,6 @@
     </w:p>
     <w:p>
       <w:pPr>
-        <w:spacing w:after="0" w:line="240" w:lineRule="auto"/>
-        <w:rPr>
-          <w:rFonts w:ascii="Arial" w:eastAsia="Times New Roman" w:hAnsi="Arial" w:cs="Arial"/>
-          <w:kern w:val="0"/>
-          <w:lang w:eastAsia="pt-BR"/>
-          <w14:ligatures w14:val="none"/>
-        </w:rPr>
-      </w:pPr>
-    </w:p>
-    <w:p>
-      <w:pPr>
         <w:spacing w:before="100" w:beforeAutospacing="1" w:after="100" w:afterAutospacing="1" w:line="240" w:lineRule="auto"/>
         <w:outlineLvl w:val="2"/>
         <w:rPr>
@@ -2560,7 +2629,18 @@
           <w:lang w:eastAsia="pt-BR"/>
           <w14:ligatures w14:val="none"/>
         </w:rPr>
-        <w:t>5.4 Temporização dos bits</w:t>
+        <w:t>4</w:t>
+      </w:r>
+      <w:r>
+        <w:rPr>
+          <w:rFonts w:ascii="Arial" w:eastAsia="Times New Roman" w:hAnsi="Arial" w:cs="Arial"/>
+          <w:b/>
+          <w:bCs/>
+          <w:kern w:val="0"/>
+          <w:lang w:eastAsia="pt-BR"/>
+          <w14:ligatures w14:val="none"/>
+        </w:rPr>
+        <w:t>.4 Temporização dos bits</w:t>
       </w:r>
     </w:p>
     <w:p>
@@ -2809,17 +2889,6 @@
     </w:p>
     <w:p>
       <w:pPr>
-        <w:spacing w:after="0" w:line="240" w:lineRule="auto"/>
-        <w:rPr>
-          <w:rFonts w:ascii="Arial" w:eastAsia="Times New Roman" w:hAnsi="Arial" w:cs="Arial"/>
-          <w:kern w:val="0"/>
-          <w:lang w:eastAsia="pt-BR"/>
-          <w14:ligatures w14:val="none"/>
-        </w:rPr>
-      </w:pPr>
-    </w:p>
-    <w:p>
-      <w:pPr>
         <w:spacing w:before="100" w:beforeAutospacing="1" w:after="100" w:afterAutospacing="1" w:line="240" w:lineRule="auto"/>
         <w:outlineLvl w:val="2"/>
         <w:rPr>
@@ -2840,7 +2909,18 @@
           <w:lang w:eastAsia="pt-BR"/>
           <w14:ligatures w14:val="none"/>
         </w:rPr>
-        <w:t>5.5 Geração do sinal NRZ-I</w:t>
+        <w:t>4</w:t>
+      </w:r>
+      <w:r>
+        <w:rPr>
+          <w:rFonts w:ascii="Arial" w:eastAsia="Times New Roman" w:hAnsi="Arial" w:cs="Arial"/>
+          <w:b/>
+          <w:bCs/>
+          <w:kern w:val="0"/>
+          <w:lang w:eastAsia="pt-BR"/>
+          <w14:ligatures w14:val="none"/>
+        </w:rPr>
+        <w:t>.5 Geração do sinal NRZ-I</w:t>
       </w:r>
     </w:p>
     <w:p>
@@ -3406,7 +3486,18 @@
           <w14:ligatures w14:val="none"/>
         </w:rPr>
         <w:lastRenderedPageBreak/>
-        <w:t>6. Mapeamento Físico na FPGA</w:t>
+        <w:t>5</w:t>
+      </w:r>
+      <w:r>
+        <w:rPr>
+          <w:rFonts w:ascii="Arial" w:eastAsia="Times New Roman" w:hAnsi="Arial" w:cs="Arial"/>
+          <w:b/>
+          <w:bCs/>
+          <w:kern w:val="0"/>
+          <w:lang w:eastAsia="pt-BR"/>
+          <w14:ligatures w14:val="none"/>
+        </w:rPr>
+        <w:t>. Mapeamento Físico na FPGA</w:t>
       </w:r>
     </w:p>
     <w:p>
@@ -4226,7 +4317,18 @@
           <w:lang w:eastAsia="pt-BR"/>
           <w14:ligatures w14:val="none"/>
         </w:rPr>
-        <w:t>7. Simulação</w:t>
+        <w:t>6</w:t>
+      </w:r>
+      <w:r>
+        <w:rPr>
+          <w:rFonts w:ascii="Arial" w:eastAsia="Times New Roman" w:hAnsi="Arial" w:cs="Arial"/>
+          <w:b/>
+          <w:bCs/>
+          <w:kern w:val="0"/>
+          <w:lang w:eastAsia="pt-BR"/>
+          <w14:ligatures w14:val="none"/>
+        </w:rPr>
+        <w:t>. Simulação</w:t>
       </w:r>
     </w:p>
     <w:p>
@@ -4699,7 +4801,18 @@
           <w:lang w:eastAsia="pt-BR"/>
           <w14:ligatures w14:val="none"/>
         </w:rPr>
-        <w:t>8. Dependências e Ambiente</w:t>
+        <w:t>7</w:t>
+      </w:r>
+      <w:r>
+        <w:rPr>
+          <w:rFonts w:ascii="Arial" w:eastAsia="Times New Roman" w:hAnsi="Arial" w:cs="Arial"/>
+          <w:b/>
+          <w:bCs/>
+          <w:kern w:val="0"/>
+          <w:lang w:eastAsia="pt-BR"/>
+          <w14:ligatures w14:val="none"/>
+        </w:rPr>
+        <w:t>. Dependências e Ambiente</w:t>
       </w:r>
     </w:p>
     <w:p>
@@ -5265,7 +5378,18 @@
           <w:lang w:eastAsia="pt-BR"/>
           <w14:ligatures w14:val="none"/>
         </w:rPr>
-        <w:t>9. Organização dos Arquivos</w:t>
+        <w:t>8</w:t>
+      </w:r>
+      <w:r>
+        <w:rPr>
+          <w:rFonts w:ascii="Arial" w:eastAsia="Times New Roman" w:hAnsi="Arial" w:cs="Arial"/>
+          <w:b/>
+          <w:bCs/>
+          <w:kern w:val="0"/>
+          <w:lang w:eastAsia="pt-BR"/>
+          <w14:ligatures w14:val="none"/>
+        </w:rPr>
+        <w:t>. Organização dos Arquivos</w:t>
       </w:r>
     </w:p>
     <w:tbl>
@@ -5659,7 +5783,18 @@
           <w:lang w:eastAsia="pt-BR"/>
           <w14:ligatures w14:val="none"/>
         </w:rPr>
-        <w:t>10. Considerações Finais</w:t>
+        <w:t>9</w:t>
+      </w:r>
+      <w:r>
+        <w:rPr>
+          <w:rFonts w:ascii="Arial" w:eastAsia="Times New Roman" w:hAnsi="Arial" w:cs="Arial"/>
+          <w:b/>
+          <w:bCs/>
+          <w:kern w:val="0"/>
+          <w:lang w:eastAsia="pt-BR"/>
+          <w14:ligatures w14:val="none"/>
+        </w:rPr>
+        <w:t>. Considerações Finais</w:t>
       </w:r>
     </w:p>
     <w:p>

</xml_diff>